<commit_message>
Diagramas Entidad - Relación
</commit_message>
<xml_diff>
--- a/Entrega_2_diagramas_diseño.docx
+++ b/Entrega_2_diagramas_diseño.docx
@@ -1303,7 +1303,25 @@
           <w:sz w:val="22"/>
           <w:szCs w:val="22"/>
         </w:rPr>
-        <w:t>fue elaborado en draw.oi con un código mermaid</w:t>
+        <w:t xml:space="preserve">fue elaborado en </w:t>
+      </w:r>
+      <w:proofErr w:type="gramStart"/>
+      <w:r>
+        <w:rPr>
+          <w:rFonts w:ascii="Arial" w:hAnsi="Arial" w:cs="Arial"/>
+          <w:sz w:val="22"/>
+          <w:szCs w:val="22"/>
+        </w:rPr>
+        <w:t>draw.oi</w:t>
+      </w:r>
+      <w:proofErr w:type="gramEnd"/>
+      <w:r>
+        <w:rPr>
+          <w:rFonts w:ascii="Arial" w:hAnsi="Arial" w:cs="Arial"/>
+          <w:sz w:val="22"/>
+          <w:szCs w:val="22"/>
+        </w:rPr>
+        <w:t xml:space="preserve"> con un código mermaid</w:t>
       </w:r>
     </w:p>
     <w:p>
@@ -3052,7 +3070,59 @@
                 <w:lang w:val="en-US" w:eastAsia="es-CO"/>
                 <w14:ligatures w14:val="none"/>
               </w:rPr>
-              <w:t>/suppliers, /purchase-orders, /purchase-orders/{id}/receipts</w:t>
+              <w:t>/</w:t>
+            </w:r>
+            <w:proofErr w:type="gramStart"/>
+            <w:r>
+              <w:rPr>
+                <w:rFonts w:ascii="Arial" w:eastAsia="Times New Roman" w:hAnsi="Arial" w:cs="Arial"/>
+                <w:color w:val="000000"/>
+                <w:kern w:val="0"/>
+                <w:sz w:val="18"/>
+                <w:szCs w:val="18"/>
+                <w:lang w:val="en-US" w:eastAsia="es-CO"/>
+                <w14:ligatures w14:val="none"/>
+              </w:rPr>
+              <w:t>suppliers</w:t>
+            </w:r>
+            <w:proofErr w:type="gramEnd"/>
+            <w:r>
+              <w:rPr>
+                <w:rFonts w:ascii="Arial" w:eastAsia="Times New Roman" w:hAnsi="Arial" w:cs="Arial"/>
+                <w:color w:val="000000"/>
+                <w:kern w:val="0"/>
+                <w:sz w:val="18"/>
+                <w:szCs w:val="18"/>
+                <w:lang w:val="en-US" w:eastAsia="es-CO"/>
+                <w14:ligatures w14:val="none"/>
+              </w:rPr>
+              <w:t>, /purchase-orders, /purchase-</w:t>
+            </w:r>
+            <w:proofErr w:type="gramStart"/>
+            <w:r>
+              <w:rPr>
+                <w:rFonts w:ascii="Arial" w:eastAsia="Times New Roman" w:hAnsi="Arial" w:cs="Arial"/>
+                <w:color w:val="000000"/>
+                <w:kern w:val="0"/>
+                <w:sz w:val="18"/>
+                <w:szCs w:val="18"/>
+                <w:lang w:val="en-US" w:eastAsia="es-CO"/>
+                <w14:ligatures w14:val="none"/>
+              </w:rPr>
+              <w:t>orders/{id}/</w:t>
+            </w:r>
+            <w:proofErr w:type="gramEnd"/>
+            <w:r>
+              <w:rPr>
+                <w:rFonts w:ascii="Arial" w:eastAsia="Times New Roman" w:hAnsi="Arial" w:cs="Arial"/>
+                <w:color w:val="000000"/>
+                <w:kern w:val="0"/>
+                <w:sz w:val="18"/>
+                <w:szCs w:val="18"/>
+                <w:lang w:val="en-US" w:eastAsia="es-CO"/>
+                <w14:ligatures w14:val="none"/>
+              </w:rPr>
+              <w:t>receipts</w:t>
             </w:r>
           </w:p>
         </w:tc>
@@ -5547,6 +5617,7 @@
               <w:t xml:space="preserve"> </w:t>
             </w:r>
             <w:proofErr w:type="spellStart"/>
+            <w:proofErr w:type="gramStart"/>
             <w:r>
               <w:rPr>
                 <w:rFonts w:ascii="Arial" w:eastAsia="Calibri" w:hAnsi="Arial" w:cs="Arial"/>
@@ -5572,6 +5643,7 @@
               <w:t>.oi</w:t>
             </w:r>
             <w:proofErr w:type="spellEnd"/>
+            <w:proofErr w:type="gramEnd"/>
             <w:r>
               <w:rPr>
                 <w:rFonts w:ascii="Arial" w:eastAsia="Calibri" w:hAnsi="Arial" w:cs="Arial"/>
@@ -5960,6 +6032,1928 @@
       </w:tr>
     </w:tbl>
     <w:p/>
+    <w:p/>
+    <w:p/>
+    <w:p/>
+    <w:p/>
+    <w:p/>
+    <w:p/>
+    <w:p/>
+    <w:p/>
+    <w:p/>
+    <w:p/>
+    <w:tbl>
+      <w:tblPr>
+        <w:tblW w:w="10080" w:type="dxa"/>
+        <w:tblBorders>
+          <w:top w:val="single" w:sz="4" w:space="0" w:color="auto"/>
+          <w:left w:val="single" w:sz="4" w:space="0" w:color="auto"/>
+          <w:bottom w:val="single" w:sz="4" w:space="0" w:color="auto"/>
+          <w:right w:val="single" w:sz="4" w:space="0" w:color="auto"/>
+          <w:insideH w:val="single" w:sz="4" w:space="0" w:color="auto"/>
+          <w:insideV w:val="single" w:sz="4" w:space="0" w:color="auto"/>
+        </w:tblBorders>
+        <w:tblLayout w:type="fixed"/>
+        <w:tblCellMar>
+          <w:left w:w="10" w:type="dxa"/>
+          <w:right w:w="10" w:type="dxa"/>
+        </w:tblCellMar>
+        <w:tblLook w:val="04A0" w:firstRow="1" w:lastRow="0" w:firstColumn="1" w:lastColumn="0" w:noHBand="0" w:noVBand="1"/>
+      </w:tblPr>
+      <w:tblGrid>
+        <w:gridCol w:w="1129"/>
+        <w:gridCol w:w="1134"/>
+        <w:gridCol w:w="1137"/>
+        <w:gridCol w:w="1273"/>
+        <w:gridCol w:w="2410"/>
+        <w:gridCol w:w="1276"/>
+        <w:gridCol w:w="1721"/>
+      </w:tblGrid>
+      <w:tr>
+        <w:trPr>
+          <w:tblHeader/>
+        </w:trPr>
+        <w:tc>
+          <w:tcPr>
+            <w:tcW w:w="1129" w:type="dxa"/>
+            <w:tcBorders>
+              <w:top w:val="single" w:sz="4" w:space="0" w:color="auto"/>
+              <w:left w:val="single" w:sz="4" w:space="0" w:color="auto"/>
+              <w:bottom w:val="single" w:sz="4" w:space="0" w:color="auto"/>
+              <w:right w:val="single" w:sz="4" w:space="0" w:color="auto"/>
+            </w:tcBorders>
+            <w:shd w:val="clear" w:color="auto" w:fill="2E5395"/>
+            <w:tcMar>
+              <w:top w:w="80" w:type="dxa"/>
+              <w:left w:w="100" w:type="dxa"/>
+              <w:bottom w:w="80" w:type="dxa"/>
+              <w:right w:w="100" w:type="dxa"/>
+            </w:tcMar>
+            <w:vAlign w:val="center"/>
+            <w:hideMark/>
+          </w:tcPr>
+          <w:p>
+            <w:pPr>
+              <w:spacing w:after="0" w:line="240" w:lineRule="auto"/>
+              <w:jc w:val="center"/>
+              <w:rPr>
+                <w:rFonts w:ascii="Times New Roman" w:eastAsia="Times New Roman" w:hAnsi="Times New Roman" w:cs="Times New Roman"/>
+                <w:kern w:val="0"/>
+                <w:sz w:val="20"/>
+                <w:szCs w:val="20"/>
+                <w:lang w:eastAsia="es-CO"/>
+                <w14:ligatures w14:val="none"/>
+              </w:rPr>
+            </w:pPr>
+            <w:r>
+              <w:rPr>
+                <w:rFonts w:ascii="Calibri" w:eastAsia="Calibri" w:hAnsi="Calibri" w:cs="Calibri"/>
+                <w:b/>
+                <w:bCs/>
+                <w:color w:val="FFFFFF"/>
+                <w:kern w:val="0"/>
+                <w:sz w:val="19"/>
+                <w:szCs w:val="19"/>
+                <w:lang w:eastAsia="es-CO"/>
+                <w14:ligatures w14:val="none"/>
+              </w:rPr>
+              <w:lastRenderedPageBreak/>
+              <w:t>Fecha</w:t>
+            </w:r>
+          </w:p>
+        </w:tc>
+        <w:tc>
+          <w:tcPr>
+            <w:tcW w:w="1134" w:type="dxa"/>
+            <w:tcBorders>
+              <w:top w:val="single" w:sz="4" w:space="0" w:color="auto"/>
+              <w:left w:val="single" w:sz="4" w:space="0" w:color="auto"/>
+              <w:bottom w:val="single" w:sz="4" w:space="0" w:color="auto"/>
+              <w:right w:val="single" w:sz="4" w:space="0" w:color="auto"/>
+            </w:tcBorders>
+            <w:shd w:val="clear" w:color="auto" w:fill="2E5395"/>
+            <w:tcMar>
+              <w:top w:w="80" w:type="dxa"/>
+              <w:left w:w="100" w:type="dxa"/>
+              <w:bottom w:w="80" w:type="dxa"/>
+              <w:right w:w="100" w:type="dxa"/>
+            </w:tcMar>
+            <w:vAlign w:val="center"/>
+            <w:hideMark/>
+          </w:tcPr>
+          <w:p>
+            <w:pPr>
+              <w:spacing w:after="0" w:line="240" w:lineRule="auto"/>
+              <w:jc w:val="center"/>
+              <w:rPr>
+                <w:rFonts w:ascii="Times New Roman" w:eastAsia="Times New Roman" w:hAnsi="Times New Roman" w:cs="Times New Roman"/>
+                <w:kern w:val="0"/>
+                <w:sz w:val="20"/>
+                <w:szCs w:val="20"/>
+                <w:lang w:eastAsia="es-CO"/>
+                <w14:ligatures w14:val="none"/>
+              </w:rPr>
+            </w:pPr>
+            <w:r>
+              <w:rPr>
+                <w:rFonts w:ascii="Calibri" w:eastAsia="Calibri" w:hAnsi="Calibri" w:cs="Calibri"/>
+                <w:b/>
+                <w:bCs/>
+                <w:color w:val="FFFFFF"/>
+                <w:kern w:val="0"/>
+                <w:sz w:val="19"/>
+                <w:szCs w:val="19"/>
+                <w:lang w:eastAsia="es-CO"/>
+                <w14:ligatures w14:val="none"/>
+              </w:rPr>
+              <w:t>Integrante</w:t>
+            </w:r>
+          </w:p>
+        </w:tc>
+        <w:tc>
+          <w:tcPr>
+            <w:tcW w:w="1137" w:type="dxa"/>
+            <w:tcBorders>
+              <w:top w:val="single" w:sz="4" w:space="0" w:color="auto"/>
+              <w:left w:val="single" w:sz="4" w:space="0" w:color="auto"/>
+              <w:bottom w:val="single" w:sz="4" w:space="0" w:color="auto"/>
+              <w:right w:val="single" w:sz="4" w:space="0" w:color="auto"/>
+            </w:tcBorders>
+            <w:shd w:val="clear" w:color="auto" w:fill="2E5395"/>
+            <w:tcMar>
+              <w:top w:w="80" w:type="dxa"/>
+              <w:left w:w="100" w:type="dxa"/>
+              <w:bottom w:w="80" w:type="dxa"/>
+              <w:right w:w="100" w:type="dxa"/>
+            </w:tcMar>
+            <w:vAlign w:val="center"/>
+            <w:hideMark/>
+          </w:tcPr>
+          <w:p>
+            <w:pPr>
+              <w:spacing w:after="0" w:line="240" w:lineRule="auto"/>
+              <w:jc w:val="center"/>
+              <w:rPr>
+                <w:rFonts w:ascii="Times New Roman" w:eastAsia="Times New Roman" w:hAnsi="Times New Roman" w:cs="Times New Roman"/>
+                <w:kern w:val="0"/>
+                <w:sz w:val="20"/>
+                <w:szCs w:val="20"/>
+                <w:lang w:eastAsia="es-CO"/>
+                <w14:ligatures w14:val="none"/>
+              </w:rPr>
+            </w:pPr>
+            <w:r>
+              <w:rPr>
+                <w:rFonts w:ascii="Calibri" w:eastAsia="Calibri" w:hAnsi="Calibri" w:cs="Calibri"/>
+                <w:b/>
+                <w:bCs/>
+                <w:color w:val="FFFFFF"/>
+                <w:kern w:val="0"/>
+                <w:sz w:val="19"/>
+                <w:szCs w:val="19"/>
+                <w:lang w:eastAsia="es-CO"/>
+                <w14:ligatures w14:val="none"/>
+              </w:rPr>
+              <w:t>Herramienta de IA</w:t>
+            </w:r>
+          </w:p>
+        </w:tc>
+        <w:tc>
+          <w:tcPr>
+            <w:tcW w:w="1273" w:type="dxa"/>
+            <w:tcBorders>
+              <w:top w:val="single" w:sz="4" w:space="0" w:color="auto"/>
+              <w:left w:val="single" w:sz="4" w:space="0" w:color="auto"/>
+              <w:bottom w:val="single" w:sz="4" w:space="0" w:color="auto"/>
+              <w:right w:val="single" w:sz="4" w:space="0" w:color="auto"/>
+            </w:tcBorders>
+            <w:shd w:val="clear" w:color="auto" w:fill="2E5395"/>
+            <w:tcMar>
+              <w:top w:w="80" w:type="dxa"/>
+              <w:left w:w="100" w:type="dxa"/>
+              <w:bottom w:w="80" w:type="dxa"/>
+              <w:right w:w="100" w:type="dxa"/>
+            </w:tcMar>
+            <w:vAlign w:val="center"/>
+            <w:hideMark/>
+          </w:tcPr>
+          <w:p>
+            <w:pPr>
+              <w:spacing w:after="0" w:line="240" w:lineRule="auto"/>
+              <w:jc w:val="center"/>
+              <w:rPr>
+                <w:rFonts w:ascii="Times New Roman" w:eastAsia="Times New Roman" w:hAnsi="Times New Roman" w:cs="Times New Roman"/>
+                <w:kern w:val="0"/>
+                <w:sz w:val="20"/>
+                <w:szCs w:val="20"/>
+                <w:lang w:eastAsia="es-CO"/>
+                <w14:ligatures w14:val="none"/>
+              </w:rPr>
+            </w:pPr>
+            <w:r>
+              <w:rPr>
+                <w:rFonts w:ascii="Calibri" w:eastAsia="Calibri" w:hAnsi="Calibri" w:cs="Calibri"/>
+                <w:b/>
+                <w:bCs/>
+                <w:color w:val="FFFFFF"/>
+                <w:kern w:val="0"/>
+                <w:sz w:val="19"/>
+                <w:szCs w:val="19"/>
+                <w:lang w:eastAsia="es-CO"/>
+                <w14:ligatures w14:val="none"/>
+              </w:rPr>
+              <w:t>Tarea / actividad apoyada</w:t>
+            </w:r>
+          </w:p>
+        </w:tc>
+        <w:tc>
+          <w:tcPr>
+            <w:tcW w:w="2410" w:type="dxa"/>
+            <w:tcBorders>
+              <w:top w:val="single" w:sz="4" w:space="0" w:color="auto"/>
+              <w:left w:val="single" w:sz="4" w:space="0" w:color="auto"/>
+              <w:bottom w:val="single" w:sz="4" w:space="0" w:color="auto"/>
+              <w:right w:val="single" w:sz="4" w:space="0" w:color="auto"/>
+            </w:tcBorders>
+            <w:shd w:val="clear" w:color="auto" w:fill="2E5395"/>
+            <w:tcMar>
+              <w:top w:w="80" w:type="dxa"/>
+              <w:left w:w="100" w:type="dxa"/>
+              <w:bottom w:w="80" w:type="dxa"/>
+              <w:right w:w="100" w:type="dxa"/>
+            </w:tcMar>
+            <w:vAlign w:val="center"/>
+            <w:hideMark/>
+          </w:tcPr>
+          <w:p>
+            <w:pPr>
+              <w:spacing w:after="0" w:line="240" w:lineRule="auto"/>
+              <w:jc w:val="center"/>
+              <w:rPr>
+                <w:rFonts w:ascii="Times New Roman" w:eastAsia="Times New Roman" w:hAnsi="Times New Roman" w:cs="Times New Roman"/>
+                <w:kern w:val="0"/>
+                <w:sz w:val="20"/>
+                <w:szCs w:val="20"/>
+                <w:lang w:eastAsia="es-CO"/>
+                <w14:ligatures w14:val="none"/>
+              </w:rPr>
+            </w:pPr>
+            <w:proofErr w:type="spellStart"/>
+            <w:r>
+              <w:rPr>
+                <w:rFonts w:ascii="Calibri" w:eastAsia="Calibri" w:hAnsi="Calibri" w:cs="Calibri"/>
+                <w:b/>
+                <w:bCs/>
+                <w:color w:val="FFFFFF"/>
+                <w:kern w:val="0"/>
+                <w:sz w:val="19"/>
+                <w:szCs w:val="19"/>
+                <w:lang w:eastAsia="es-CO"/>
+                <w14:ligatures w14:val="none"/>
+              </w:rPr>
+              <w:t>Prompt</w:t>
+            </w:r>
+            <w:proofErr w:type="spellEnd"/>
+            <w:r>
+              <w:rPr>
+                <w:rFonts w:ascii="Calibri" w:eastAsia="Calibri" w:hAnsi="Calibri" w:cs="Calibri"/>
+                <w:b/>
+                <w:bCs/>
+                <w:color w:val="FFFFFF"/>
+                <w:kern w:val="0"/>
+                <w:sz w:val="19"/>
+                <w:szCs w:val="19"/>
+                <w:lang w:eastAsia="es-CO"/>
+                <w14:ligatures w14:val="none"/>
+              </w:rPr>
+              <w:t xml:space="preserve"> utilizado (resumen)</w:t>
+            </w:r>
+          </w:p>
+        </w:tc>
+        <w:tc>
+          <w:tcPr>
+            <w:tcW w:w="1276" w:type="dxa"/>
+            <w:tcBorders>
+              <w:top w:val="single" w:sz="4" w:space="0" w:color="auto"/>
+              <w:left w:val="single" w:sz="4" w:space="0" w:color="auto"/>
+              <w:bottom w:val="single" w:sz="4" w:space="0" w:color="auto"/>
+              <w:right w:val="single" w:sz="4" w:space="0" w:color="auto"/>
+            </w:tcBorders>
+            <w:shd w:val="clear" w:color="auto" w:fill="2E5395"/>
+            <w:tcMar>
+              <w:top w:w="80" w:type="dxa"/>
+              <w:left w:w="100" w:type="dxa"/>
+              <w:bottom w:w="80" w:type="dxa"/>
+              <w:right w:w="100" w:type="dxa"/>
+            </w:tcMar>
+            <w:vAlign w:val="center"/>
+            <w:hideMark/>
+          </w:tcPr>
+          <w:p>
+            <w:pPr>
+              <w:spacing w:after="0" w:line="240" w:lineRule="auto"/>
+              <w:jc w:val="center"/>
+              <w:rPr>
+                <w:rFonts w:ascii="Times New Roman" w:eastAsia="Times New Roman" w:hAnsi="Times New Roman" w:cs="Times New Roman"/>
+                <w:kern w:val="0"/>
+                <w:sz w:val="20"/>
+                <w:szCs w:val="20"/>
+                <w:lang w:eastAsia="es-CO"/>
+                <w14:ligatures w14:val="none"/>
+              </w:rPr>
+            </w:pPr>
+            <w:r>
+              <w:rPr>
+                <w:rFonts w:ascii="Calibri" w:eastAsia="Calibri" w:hAnsi="Calibri" w:cs="Calibri"/>
+                <w:b/>
+                <w:bCs/>
+                <w:color w:val="FFFFFF"/>
+                <w:kern w:val="0"/>
+                <w:sz w:val="19"/>
+                <w:szCs w:val="19"/>
+                <w:lang w:eastAsia="es-CO"/>
+                <w14:ligatures w14:val="none"/>
+              </w:rPr>
+              <w:t>Nivel de intervención humana</w:t>
+            </w:r>
+          </w:p>
+        </w:tc>
+        <w:tc>
+          <w:tcPr>
+            <w:tcW w:w="1721" w:type="dxa"/>
+            <w:tcBorders>
+              <w:top w:val="single" w:sz="4" w:space="0" w:color="auto"/>
+              <w:left w:val="single" w:sz="4" w:space="0" w:color="auto"/>
+              <w:bottom w:val="single" w:sz="4" w:space="0" w:color="auto"/>
+              <w:right w:val="single" w:sz="4" w:space="0" w:color="auto"/>
+            </w:tcBorders>
+            <w:shd w:val="clear" w:color="auto" w:fill="2E5395"/>
+            <w:tcMar>
+              <w:top w:w="80" w:type="dxa"/>
+              <w:left w:w="100" w:type="dxa"/>
+              <w:bottom w:w="80" w:type="dxa"/>
+              <w:right w:w="100" w:type="dxa"/>
+            </w:tcMar>
+            <w:vAlign w:val="center"/>
+            <w:hideMark/>
+          </w:tcPr>
+          <w:p>
+            <w:pPr>
+              <w:spacing w:after="0" w:line="240" w:lineRule="auto"/>
+              <w:jc w:val="center"/>
+              <w:rPr>
+                <w:rFonts w:ascii="Times New Roman" w:eastAsia="Times New Roman" w:hAnsi="Times New Roman" w:cs="Times New Roman"/>
+                <w:kern w:val="0"/>
+                <w:sz w:val="20"/>
+                <w:szCs w:val="20"/>
+                <w:lang w:eastAsia="es-CO"/>
+                <w14:ligatures w14:val="none"/>
+              </w:rPr>
+            </w:pPr>
+            <w:r>
+              <w:rPr>
+                <w:rFonts w:ascii="Calibri" w:eastAsia="Calibri" w:hAnsi="Calibri" w:cs="Calibri"/>
+                <w:b/>
+                <w:bCs/>
+                <w:color w:val="FFFFFF"/>
+                <w:kern w:val="0"/>
+                <w:sz w:val="19"/>
+                <w:szCs w:val="19"/>
+                <w:lang w:eastAsia="es-CO"/>
+                <w14:ligatures w14:val="none"/>
+              </w:rPr>
+              <w:t>Resultado / aprendizaje</w:t>
+            </w:r>
+          </w:p>
+        </w:tc>
+      </w:tr>
+      <w:tr>
+        <w:tc>
+          <w:tcPr>
+            <w:tcW w:w="1129" w:type="dxa"/>
+            <w:tcBorders>
+              <w:top w:val="single" w:sz="4" w:space="0" w:color="auto"/>
+              <w:left w:val="single" w:sz="4" w:space="0" w:color="auto"/>
+              <w:bottom w:val="single" w:sz="4" w:space="0" w:color="auto"/>
+              <w:right w:val="single" w:sz="4" w:space="0" w:color="auto"/>
+            </w:tcBorders>
+            <w:tcMar>
+              <w:top w:w="80" w:type="dxa"/>
+              <w:left w:w="100" w:type="dxa"/>
+              <w:bottom w:w="80" w:type="dxa"/>
+              <w:right w:w="100" w:type="dxa"/>
+            </w:tcMar>
+            <w:vAlign w:val="center"/>
+            <w:hideMark/>
+          </w:tcPr>
+          <w:p>
+            <w:pPr>
+              <w:spacing w:after="0" w:line="240" w:lineRule="auto"/>
+              <w:jc w:val="both"/>
+              <w:rPr>
+                <w:rFonts w:ascii="Arial" w:eastAsia="Times New Roman" w:hAnsi="Arial" w:cs="Arial"/>
+                <w:kern w:val="0"/>
+                <w:sz w:val="18"/>
+                <w:szCs w:val="18"/>
+                <w:lang w:eastAsia="es-CO"/>
+                <w14:ligatures w14:val="none"/>
+              </w:rPr>
+            </w:pPr>
+            <w:r>
+              <w:rPr>
+                <w:rFonts w:ascii="Arial" w:eastAsia="Calibri" w:hAnsi="Arial" w:cs="Arial"/>
+                <w:color w:val="000000"/>
+                <w:kern w:val="0"/>
+                <w:sz w:val="18"/>
+                <w:szCs w:val="18"/>
+                <w:lang w:eastAsia="es-CO"/>
+                <w14:ligatures w14:val="none"/>
+              </w:rPr>
+              <w:t>1</w:t>
+            </w:r>
+            <w:r>
+              <w:rPr>
+                <w:rFonts w:ascii="Arial" w:eastAsia="Calibri" w:hAnsi="Arial" w:cs="Arial"/>
+                <w:color w:val="000000"/>
+                <w:kern w:val="0"/>
+                <w:sz w:val="18"/>
+                <w:szCs w:val="18"/>
+                <w:lang w:eastAsia="es-CO"/>
+                <w14:ligatures w14:val="none"/>
+              </w:rPr>
+              <w:t>0</w:t>
+            </w:r>
+            <w:r>
+              <w:rPr>
+                <w:rFonts w:ascii="Arial" w:eastAsia="Calibri" w:hAnsi="Arial" w:cs="Arial"/>
+                <w:color w:val="000000"/>
+                <w:kern w:val="0"/>
+                <w:sz w:val="18"/>
+                <w:szCs w:val="18"/>
+                <w:lang w:eastAsia="es-CO"/>
+                <w14:ligatures w14:val="none"/>
+              </w:rPr>
+              <w:t>/10/2026</w:t>
+            </w:r>
+          </w:p>
+        </w:tc>
+        <w:tc>
+          <w:tcPr>
+            <w:tcW w:w="1134" w:type="dxa"/>
+            <w:tcBorders>
+              <w:top w:val="single" w:sz="4" w:space="0" w:color="auto"/>
+              <w:left w:val="single" w:sz="4" w:space="0" w:color="auto"/>
+              <w:bottom w:val="single" w:sz="4" w:space="0" w:color="auto"/>
+              <w:right w:val="single" w:sz="4" w:space="0" w:color="auto"/>
+            </w:tcBorders>
+            <w:tcMar>
+              <w:top w:w="80" w:type="dxa"/>
+              <w:left w:w="100" w:type="dxa"/>
+              <w:bottom w:w="80" w:type="dxa"/>
+              <w:right w:w="100" w:type="dxa"/>
+            </w:tcMar>
+            <w:vAlign w:val="center"/>
+            <w:hideMark/>
+          </w:tcPr>
+          <w:p>
+            <w:pPr>
+              <w:spacing w:after="0" w:line="240" w:lineRule="auto"/>
+              <w:jc w:val="both"/>
+              <w:rPr>
+                <w:rFonts w:ascii="Arial" w:eastAsia="Times New Roman" w:hAnsi="Arial" w:cs="Arial"/>
+                <w:kern w:val="0"/>
+                <w:sz w:val="18"/>
+                <w:szCs w:val="18"/>
+                <w:lang w:eastAsia="es-CO"/>
+                <w14:ligatures w14:val="none"/>
+              </w:rPr>
+            </w:pPr>
+            <w:r>
+              <w:rPr>
+                <w:rFonts w:ascii="Arial" w:eastAsia="Calibri" w:hAnsi="Arial" w:cs="Arial"/>
+                <w:color w:val="000000"/>
+                <w:kern w:val="0"/>
+                <w:sz w:val="18"/>
+                <w:szCs w:val="18"/>
+                <w:lang w:eastAsia="es-CO"/>
+                <w14:ligatures w14:val="none"/>
+              </w:rPr>
+              <w:t xml:space="preserve">Juan Sebastián Rivera Valencia </w:t>
+            </w:r>
+          </w:p>
+        </w:tc>
+        <w:tc>
+          <w:tcPr>
+            <w:tcW w:w="1137" w:type="dxa"/>
+            <w:tcBorders>
+              <w:top w:val="single" w:sz="4" w:space="0" w:color="auto"/>
+              <w:left w:val="single" w:sz="4" w:space="0" w:color="auto"/>
+              <w:bottom w:val="single" w:sz="4" w:space="0" w:color="auto"/>
+              <w:right w:val="single" w:sz="4" w:space="0" w:color="auto"/>
+            </w:tcBorders>
+            <w:tcMar>
+              <w:top w:w="80" w:type="dxa"/>
+              <w:left w:w="100" w:type="dxa"/>
+              <w:bottom w:w="80" w:type="dxa"/>
+              <w:right w:w="100" w:type="dxa"/>
+            </w:tcMar>
+            <w:vAlign w:val="center"/>
+            <w:hideMark/>
+          </w:tcPr>
+          <w:p>
+            <w:pPr>
+              <w:spacing w:after="0" w:line="240" w:lineRule="auto"/>
+              <w:jc w:val="both"/>
+              <w:rPr>
+                <w:rFonts w:ascii="Arial" w:eastAsia="Times New Roman" w:hAnsi="Arial" w:cs="Arial"/>
+                <w:kern w:val="0"/>
+                <w:sz w:val="18"/>
+                <w:szCs w:val="18"/>
+                <w:lang w:eastAsia="es-CO"/>
+                <w14:ligatures w14:val="none"/>
+              </w:rPr>
+            </w:pPr>
+            <w:proofErr w:type="spellStart"/>
+            <w:r>
+              <w:rPr>
+                <w:rFonts w:ascii="Arial" w:eastAsia="Calibri" w:hAnsi="Arial" w:cs="Arial"/>
+                <w:color w:val="000000"/>
+                <w:kern w:val="0"/>
+                <w:sz w:val="18"/>
+                <w:szCs w:val="18"/>
+                <w:lang w:eastAsia="es-CO"/>
+                <w14:ligatures w14:val="none"/>
+              </w:rPr>
+              <w:t>ChatGPT</w:t>
+            </w:r>
+            <w:proofErr w:type="spellEnd"/>
+          </w:p>
+        </w:tc>
+        <w:tc>
+          <w:tcPr>
+            <w:tcW w:w="1273" w:type="dxa"/>
+            <w:tcBorders>
+              <w:top w:val="single" w:sz="4" w:space="0" w:color="auto"/>
+              <w:left w:val="single" w:sz="4" w:space="0" w:color="auto"/>
+              <w:bottom w:val="single" w:sz="4" w:space="0" w:color="auto"/>
+              <w:right w:val="single" w:sz="4" w:space="0" w:color="auto"/>
+            </w:tcBorders>
+            <w:tcMar>
+              <w:top w:w="80" w:type="dxa"/>
+              <w:left w:w="100" w:type="dxa"/>
+              <w:bottom w:w="80" w:type="dxa"/>
+              <w:right w:w="100" w:type="dxa"/>
+            </w:tcMar>
+            <w:vAlign w:val="center"/>
+            <w:hideMark/>
+          </w:tcPr>
+          <w:p>
+            <w:pPr>
+              <w:spacing w:after="0" w:line="240" w:lineRule="auto"/>
+              <w:jc w:val="both"/>
+              <w:rPr>
+                <w:rFonts w:ascii="Arial" w:eastAsia="Times New Roman" w:hAnsi="Arial" w:cs="Arial"/>
+                <w:kern w:val="0"/>
+                <w:sz w:val="18"/>
+                <w:szCs w:val="18"/>
+                <w:lang w:eastAsia="es-CO"/>
+                <w14:ligatures w14:val="none"/>
+              </w:rPr>
+            </w:pPr>
+            <w:r>
+              <w:rPr>
+                <w:rFonts w:ascii="Arial" w:eastAsia="Times New Roman" w:hAnsi="Arial" w:cs="Arial"/>
+                <w:kern w:val="0"/>
+                <w:sz w:val="18"/>
+                <w:szCs w:val="18"/>
+                <w:lang w:eastAsia="es-CO"/>
+                <w14:ligatures w14:val="none"/>
+              </w:rPr>
+              <w:t>Identificación de entidades por microservicio</w:t>
+            </w:r>
+          </w:p>
+          <w:p>
+            <w:pPr>
+              <w:spacing w:after="0" w:line="240" w:lineRule="auto"/>
+              <w:jc w:val="both"/>
+              <w:rPr>
+                <w:rFonts w:ascii="Arial" w:eastAsia="Times New Roman" w:hAnsi="Arial" w:cs="Arial"/>
+                <w:kern w:val="0"/>
+                <w:sz w:val="18"/>
+                <w:szCs w:val="18"/>
+                <w:lang w:eastAsia="es-CO"/>
+                <w14:ligatures w14:val="none"/>
+              </w:rPr>
+            </w:pPr>
+          </w:p>
+        </w:tc>
+        <w:tc>
+          <w:tcPr>
+            <w:tcW w:w="2410" w:type="dxa"/>
+            <w:tcBorders>
+              <w:top w:val="single" w:sz="4" w:space="0" w:color="auto"/>
+              <w:left w:val="single" w:sz="4" w:space="0" w:color="auto"/>
+              <w:bottom w:val="single" w:sz="4" w:space="0" w:color="auto"/>
+              <w:right w:val="single" w:sz="4" w:space="0" w:color="auto"/>
+            </w:tcBorders>
+            <w:tcMar>
+              <w:top w:w="80" w:type="dxa"/>
+              <w:left w:w="100" w:type="dxa"/>
+              <w:bottom w:w="80" w:type="dxa"/>
+              <w:right w:w="100" w:type="dxa"/>
+            </w:tcMar>
+            <w:vAlign w:val="center"/>
+            <w:hideMark/>
+          </w:tcPr>
+          <w:p>
+            <w:pPr>
+              <w:spacing w:after="0" w:line="240" w:lineRule="auto"/>
+              <w:rPr>
+                <w:rFonts w:ascii="Arial" w:eastAsia="Times New Roman" w:hAnsi="Arial" w:cs="Arial"/>
+                <w:kern w:val="0"/>
+                <w:sz w:val="18"/>
+                <w:szCs w:val="18"/>
+                <w:lang w:eastAsia="es-CO"/>
+                <w14:ligatures w14:val="none"/>
+              </w:rPr>
+            </w:pPr>
+            <w:r>
+              <w:rPr>
+                <w:rFonts w:ascii="Arial" w:eastAsia="Times New Roman" w:hAnsi="Arial" w:cs="Arial"/>
+                <w:kern w:val="0"/>
+                <w:sz w:val="18"/>
+                <w:szCs w:val="18"/>
+                <w:lang w:eastAsia="es-CO"/>
+                <w14:ligatures w14:val="none"/>
+              </w:rPr>
+              <w:t>Con base en los seis microservicios definidos en la primera entrega, analiza qué tablas y relaciones debe tener la base de datos independiente de cada uno, teniendo en cuenta sus responsabilidades y requerimientos funcionales.</w:t>
+            </w:r>
+          </w:p>
+          <w:p>
+            <w:pPr>
+              <w:spacing w:after="0" w:line="240" w:lineRule="auto"/>
+              <w:jc w:val="both"/>
+              <w:rPr>
+                <w:rFonts w:ascii="Arial" w:eastAsia="Times New Roman" w:hAnsi="Arial" w:cs="Arial"/>
+                <w:kern w:val="0"/>
+                <w:sz w:val="18"/>
+                <w:szCs w:val="18"/>
+                <w:lang w:eastAsia="es-CO"/>
+                <w14:ligatures w14:val="none"/>
+              </w:rPr>
+            </w:pPr>
+          </w:p>
+        </w:tc>
+        <w:tc>
+          <w:tcPr>
+            <w:tcW w:w="1276" w:type="dxa"/>
+            <w:tcBorders>
+              <w:top w:val="single" w:sz="4" w:space="0" w:color="auto"/>
+              <w:left w:val="single" w:sz="4" w:space="0" w:color="auto"/>
+              <w:bottom w:val="single" w:sz="4" w:space="0" w:color="auto"/>
+              <w:right w:val="single" w:sz="4" w:space="0" w:color="auto"/>
+            </w:tcBorders>
+            <w:tcMar>
+              <w:top w:w="80" w:type="dxa"/>
+              <w:left w:w="100" w:type="dxa"/>
+              <w:bottom w:w="80" w:type="dxa"/>
+              <w:right w:w="100" w:type="dxa"/>
+            </w:tcMar>
+            <w:vAlign w:val="center"/>
+            <w:hideMark/>
+          </w:tcPr>
+          <w:p>
+            <w:pPr>
+              <w:spacing w:after="0" w:line="240" w:lineRule="auto"/>
+              <w:jc w:val="center"/>
+              <w:rPr>
+                <w:rFonts w:ascii="Arial" w:eastAsia="Times New Roman" w:hAnsi="Arial" w:cs="Arial"/>
+                <w:kern w:val="0"/>
+                <w:sz w:val="18"/>
+                <w:szCs w:val="18"/>
+                <w:lang w:eastAsia="es-CO"/>
+                <w14:ligatures w14:val="none"/>
+              </w:rPr>
+            </w:pPr>
+            <w:r>
+              <w:rPr>
+                <w:rFonts w:ascii="Arial" w:eastAsia="Times New Roman" w:hAnsi="Arial" w:cs="Arial"/>
+                <w:kern w:val="0"/>
+                <w:sz w:val="18"/>
+                <w:szCs w:val="18"/>
+                <w:lang w:eastAsia="es-CO"/>
+                <w14:ligatures w14:val="none"/>
+              </w:rPr>
+              <w:t>Alto</w:t>
+            </w:r>
+          </w:p>
+        </w:tc>
+        <w:tc>
+          <w:tcPr>
+            <w:tcW w:w="1721" w:type="dxa"/>
+            <w:tcBorders>
+              <w:top w:val="single" w:sz="4" w:space="0" w:color="auto"/>
+              <w:left w:val="single" w:sz="4" w:space="0" w:color="auto"/>
+              <w:bottom w:val="single" w:sz="4" w:space="0" w:color="auto"/>
+              <w:right w:val="single" w:sz="4" w:space="0" w:color="auto"/>
+            </w:tcBorders>
+            <w:tcMar>
+              <w:top w:w="80" w:type="dxa"/>
+              <w:left w:w="100" w:type="dxa"/>
+              <w:bottom w:w="80" w:type="dxa"/>
+              <w:right w:w="100" w:type="dxa"/>
+            </w:tcMar>
+            <w:vAlign w:val="center"/>
+            <w:hideMark/>
+          </w:tcPr>
+          <w:p>
+            <w:pPr>
+              <w:spacing w:after="0" w:line="240" w:lineRule="auto"/>
+              <w:rPr>
+                <w:rFonts w:ascii="Arial" w:eastAsia="Times New Roman" w:hAnsi="Arial" w:cs="Arial"/>
+                <w:kern w:val="0"/>
+                <w:sz w:val="18"/>
+                <w:szCs w:val="18"/>
+                <w:lang w:eastAsia="es-CO"/>
+                <w14:ligatures w14:val="none"/>
+              </w:rPr>
+            </w:pPr>
+            <w:r>
+              <w:rPr>
+                <w:rFonts w:ascii="Arial" w:eastAsia="Times New Roman" w:hAnsi="Arial" w:cs="Arial"/>
+                <w:kern w:val="0"/>
+                <w:sz w:val="18"/>
+                <w:szCs w:val="18"/>
+                <w:lang w:eastAsia="es-CO"/>
+                <w14:ligatures w14:val="none"/>
+              </w:rPr>
+              <w:t>Comprendí que cada microservicio puede tener varias tablas normalizadas, con claves primarias y foráneas internas, pero sin establecer relaciones SQL directas con las bases de datos de otros microservicios.</w:t>
+            </w:r>
+          </w:p>
+          <w:p>
+            <w:pPr>
+              <w:spacing w:after="0" w:line="240" w:lineRule="auto"/>
+              <w:jc w:val="both"/>
+              <w:rPr>
+                <w:rFonts w:ascii="Arial" w:eastAsia="Times New Roman" w:hAnsi="Arial" w:cs="Arial"/>
+                <w:kern w:val="0"/>
+                <w:sz w:val="18"/>
+                <w:szCs w:val="18"/>
+                <w:lang w:eastAsia="es-CO"/>
+                <w14:ligatures w14:val="none"/>
+              </w:rPr>
+            </w:pPr>
+          </w:p>
+        </w:tc>
+      </w:tr>
+      <w:tr>
+        <w:tc>
+          <w:tcPr>
+            <w:tcW w:w="1129" w:type="dxa"/>
+            <w:tcBorders>
+              <w:top w:val="single" w:sz="4" w:space="0" w:color="auto"/>
+              <w:left w:val="single" w:sz="4" w:space="0" w:color="auto"/>
+              <w:bottom w:val="single" w:sz="4" w:space="0" w:color="auto"/>
+              <w:right w:val="single" w:sz="4" w:space="0" w:color="auto"/>
+            </w:tcBorders>
+            <w:tcMar>
+              <w:top w:w="80" w:type="dxa"/>
+              <w:left w:w="100" w:type="dxa"/>
+              <w:bottom w:w="80" w:type="dxa"/>
+              <w:right w:w="100" w:type="dxa"/>
+            </w:tcMar>
+            <w:vAlign w:val="center"/>
+          </w:tcPr>
+          <w:p>
+            <w:pPr>
+              <w:spacing w:after="0" w:line="240" w:lineRule="auto"/>
+              <w:jc w:val="both"/>
+              <w:rPr>
+                <w:rFonts w:ascii="Arial" w:eastAsia="Calibri" w:hAnsi="Arial" w:cs="Arial"/>
+                <w:color w:val="000000"/>
+                <w:kern w:val="0"/>
+                <w:sz w:val="18"/>
+                <w:szCs w:val="18"/>
+                <w:lang w:eastAsia="es-CO"/>
+                <w14:ligatures w14:val="none"/>
+              </w:rPr>
+            </w:pPr>
+            <w:r>
+              <w:rPr>
+                <w:rFonts w:ascii="Arial" w:eastAsia="Calibri" w:hAnsi="Arial" w:cs="Arial"/>
+                <w:color w:val="000000"/>
+                <w:kern w:val="0"/>
+                <w:sz w:val="18"/>
+                <w:szCs w:val="18"/>
+                <w:lang w:eastAsia="es-CO"/>
+                <w14:ligatures w14:val="none"/>
+              </w:rPr>
+              <w:t>10</w:t>
+            </w:r>
+            <w:r>
+              <w:rPr>
+                <w:rFonts w:ascii="Arial" w:eastAsia="Calibri" w:hAnsi="Arial" w:cs="Arial"/>
+                <w:color w:val="000000"/>
+                <w:kern w:val="0"/>
+                <w:sz w:val="18"/>
+                <w:szCs w:val="18"/>
+                <w:lang w:eastAsia="es-CO"/>
+                <w14:ligatures w14:val="none"/>
+              </w:rPr>
+              <w:t>/10/2026</w:t>
+            </w:r>
+          </w:p>
+        </w:tc>
+        <w:tc>
+          <w:tcPr>
+            <w:tcW w:w="1134" w:type="dxa"/>
+            <w:tcBorders>
+              <w:top w:val="single" w:sz="4" w:space="0" w:color="auto"/>
+              <w:left w:val="single" w:sz="4" w:space="0" w:color="auto"/>
+              <w:bottom w:val="single" w:sz="4" w:space="0" w:color="auto"/>
+              <w:right w:val="single" w:sz="4" w:space="0" w:color="auto"/>
+            </w:tcBorders>
+            <w:tcMar>
+              <w:top w:w="80" w:type="dxa"/>
+              <w:left w:w="100" w:type="dxa"/>
+              <w:bottom w:w="80" w:type="dxa"/>
+              <w:right w:w="100" w:type="dxa"/>
+            </w:tcMar>
+            <w:vAlign w:val="center"/>
+          </w:tcPr>
+          <w:p>
+            <w:pPr>
+              <w:spacing w:after="0" w:line="240" w:lineRule="auto"/>
+              <w:jc w:val="both"/>
+              <w:rPr>
+                <w:rFonts w:ascii="Arial" w:eastAsia="Calibri" w:hAnsi="Arial" w:cs="Arial"/>
+                <w:color w:val="000000"/>
+                <w:kern w:val="0"/>
+                <w:sz w:val="18"/>
+                <w:szCs w:val="18"/>
+                <w:lang w:eastAsia="es-CO"/>
+                <w14:ligatures w14:val="none"/>
+              </w:rPr>
+            </w:pPr>
+            <w:r>
+              <w:rPr>
+                <w:rFonts w:ascii="Arial" w:eastAsia="Calibri" w:hAnsi="Arial" w:cs="Arial"/>
+                <w:color w:val="000000"/>
+                <w:kern w:val="0"/>
+                <w:sz w:val="18"/>
+                <w:szCs w:val="18"/>
+                <w:lang w:eastAsia="es-CO"/>
+                <w14:ligatures w14:val="none"/>
+              </w:rPr>
+              <w:t>Juan Sebastián Rivera Valencia</w:t>
+            </w:r>
+          </w:p>
+        </w:tc>
+        <w:tc>
+          <w:tcPr>
+            <w:tcW w:w="1137" w:type="dxa"/>
+            <w:tcBorders>
+              <w:top w:val="single" w:sz="4" w:space="0" w:color="auto"/>
+              <w:left w:val="single" w:sz="4" w:space="0" w:color="auto"/>
+              <w:bottom w:val="single" w:sz="4" w:space="0" w:color="auto"/>
+              <w:right w:val="single" w:sz="4" w:space="0" w:color="auto"/>
+            </w:tcBorders>
+            <w:tcMar>
+              <w:top w:w="80" w:type="dxa"/>
+              <w:left w:w="100" w:type="dxa"/>
+              <w:bottom w:w="80" w:type="dxa"/>
+              <w:right w:w="100" w:type="dxa"/>
+            </w:tcMar>
+            <w:vAlign w:val="center"/>
+          </w:tcPr>
+          <w:p>
+            <w:pPr>
+              <w:spacing w:after="0" w:line="240" w:lineRule="auto"/>
+              <w:jc w:val="both"/>
+              <w:rPr>
+                <w:rFonts w:ascii="Arial" w:eastAsia="Calibri" w:hAnsi="Arial" w:cs="Arial"/>
+                <w:color w:val="000000"/>
+                <w:kern w:val="0"/>
+                <w:sz w:val="18"/>
+                <w:szCs w:val="18"/>
+                <w:lang w:eastAsia="es-CO"/>
+                <w14:ligatures w14:val="none"/>
+              </w:rPr>
+            </w:pPr>
+            <w:proofErr w:type="spellStart"/>
+            <w:r>
+              <w:rPr>
+                <w:rFonts w:ascii="Arial" w:eastAsia="Calibri" w:hAnsi="Arial" w:cs="Arial"/>
+                <w:color w:val="000000"/>
+                <w:kern w:val="0"/>
+                <w:sz w:val="18"/>
+                <w:szCs w:val="18"/>
+                <w:lang w:eastAsia="es-CO"/>
+                <w14:ligatures w14:val="none"/>
+              </w:rPr>
+              <w:t>ChatGPT</w:t>
+            </w:r>
+            <w:proofErr w:type="spellEnd"/>
+          </w:p>
+        </w:tc>
+        <w:tc>
+          <w:tcPr>
+            <w:tcW w:w="1273" w:type="dxa"/>
+            <w:tcBorders>
+              <w:top w:val="single" w:sz="4" w:space="0" w:color="auto"/>
+              <w:left w:val="single" w:sz="4" w:space="0" w:color="auto"/>
+              <w:bottom w:val="single" w:sz="4" w:space="0" w:color="auto"/>
+              <w:right w:val="single" w:sz="4" w:space="0" w:color="auto"/>
+            </w:tcBorders>
+            <w:tcMar>
+              <w:top w:w="80" w:type="dxa"/>
+              <w:left w:w="100" w:type="dxa"/>
+              <w:bottom w:w="80" w:type="dxa"/>
+              <w:right w:w="100" w:type="dxa"/>
+            </w:tcMar>
+            <w:vAlign w:val="center"/>
+          </w:tcPr>
+          <w:p>
+            <w:pPr>
+              <w:spacing w:after="0" w:line="240" w:lineRule="auto"/>
+              <w:jc w:val="both"/>
+              <w:rPr>
+                <w:rFonts w:ascii="Arial" w:eastAsia="Times New Roman" w:hAnsi="Arial" w:cs="Arial"/>
+                <w:kern w:val="0"/>
+                <w:sz w:val="18"/>
+                <w:szCs w:val="18"/>
+                <w:lang w:eastAsia="es-CO"/>
+                <w14:ligatures w14:val="none"/>
+              </w:rPr>
+            </w:pPr>
+            <w:r>
+              <w:rPr>
+                <w:rFonts w:ascii="Arial" w:eastAsia="Times New Roman" w:hAnsi="Arial" w:cs="Arial"/>
+                <w:kern w:val="0"/>
+                <w:sz w:val="18"/>
+                <w:szCs w:val="18"/>
+                <w:lang w:eastAsia="es-CO"/>
+                <w14:ligatures w14:val="none"/>
+              </w:rPr>
+              <w:t>Diseño de modelos entidad-relación en draw.io</w:t>
+            </w:r>
+          </w:p>
+          <w:p>
+            <w:pPr>
+              <w:spacing w:after="0" w:line="240" w:lineRule="auto"/>
+              <w:jc w:val="both"/>
+              <w:rPr>
+                <w:rFonts w:ascii="Arial" w:eastAsia="Times New Roman" w:hAnsi="Arial" w:cs="Arial"/>
+                <w:kern w:val="0"/>
+                <w:sz w:val="18"/>
+                <w:szCs w:val="18"/>
+                <w:lang w:eastAsia="es-CO"/>
+                <w14:ligatures w14:val="none"/>
+              </w:rPr>
+            </w:pPr>
+          </w:p>
+        </w:tc>
+        <w:tc>
+          <w:tcPr>
+            <w:tcW w:w="2410" w:type="dxa"/>
+            <w:tcBorders>
+              <w:top w:val="single" w:sz="4" w:space="0" w:color="auto"/>
+              <w:left w:val="single" w:sz="4" w:space="0" w:color="auto"/>
+              <w:bottom w:val="single" w:sz="4" w:space="0" w:color="auto"/>
+              <w:right w:val="single" w:sz="4" w:space="0" w:color="auto"/>
+            </w:tcBorders>
+            <w:tcMar>
+              <w:top w:w="80" w:type="dxa"/>
+              <w:left w:w="100" w:type="dxa"/>
+              <w:bottom w:w="80" w:type="dxa"/>
+              <w:right w:w="100" w:type="dxa"/>
+            </w:tcMar>
+            <w:vAlign w:val="center"/>
+          </w:tcPr>
+          <w:p>
+            <w:pPr>
+              <w:spacing w:after="0" w:line="240" w:lineRule="auto"/>
+              <w:jc w:val="both"/>
+              <w:rPr>
+                <w:rFonts w:ascii="Arial" w:eastAsia="Times New Roman" w:hAnsi="Arial" w:cs="Arial"/>
+                <w:kern w:val="0"/>
+                <w:sz w:val="18"/>
+                <w:szCs w:val="18"/>
+                <w:lang w:eastAsia="es-CO"/>
+                <w14:ligatures w14:val="none"/>
+              </w:rPr>
+            </w:pPr>
+            <w:r>
+              <w:rPr>
+                <w:rFonts w:ascii="Arial" w:eastAsia="Times New Roman" w:hAnsi="Arial" w:cs="Arial"/>
+                <w:kern w:val="0"/>
+                <w:sz w:val="18"/>
+                <w:szCs w:val="18"/>
+                <w:lang w:eastAsia="es-CO"/>
+                <w14:ligatures w14:val="none"/>
+              </w:rPr>
+              <w:t>Crea en draw.io seis modelos entidad-relación editables, uno por microservicio, incluyendo las entidades, atributos, claves primarias, claves foráneas y cardinalidades. Respeta la arquitectura definida y entrega los archivos editables.</w:t>
+            </w:r>
+          </w:p>
+          <w:p>
+            <w:pPr>
+              <w:spacing w:after="0" w:line="240" w:lineRule="auto"/>
+              <w:jc w:val="both"/>
+              <w:rPr>
+                <w:rFonts w:ascii="Arial" w:eastAsia="Calibri" w:hAnsi="Arial" w:cs="Arial"/>
+                <w:color w:val="000000"/>
+                <w:kern w:val="0"/>
+                <w:sz w:val="18"/>
+                <w:szCs w:val="18"/>
+                <w:lang w:eastAsia="es-CO"/>
+                <w14:ligatures w14:val="none"/>
+              </w:rPr>
+            </w:pPr>
+          </w:p>
+        </w:tc>
+        <w:tc>
+          <w:tcPr>
+            <w:tcW w:w="1276" w:type="dxa"/>
+            <w:tcBorders>
+              <w:top w:val="single" w:sz="4" w:space="0" w:color="auto"/>
+              <w:left w:val="single" w:sz="4" w:space="0" w:color="auto"/>
+              <w:bottom w:val="single" w:sz="4" w:space="0" w:color="auto"/>
+              <w:right w:val="single" w:sz="4" w:space="0" w:color="auto"/>
+            </w:tcBorders>
+            <w:tcMar>
+              <w:top w:w="80" w:type="dxa"/>
+              <w:left w:w="100" w:type="dxa"/>
+              <w:bottom w:w="80" w:type="dxa"/>
+              <w:right w:w="100" w:type="dxa"/>
+            </w:tcMar>
+            <w:vAlign w:val="center"/>
+          </w:tcPr>
+          <w:p>
+            <w:pPr>
+              <w:spacing w:after="0" w:line="240" w:lineRule="auto"/>
+              <w:jc w:val="center"/>
+              <w:rPr>
+                <w:rFonts w:ascii="Arial" w:eastAsia="Times New Roman" w:hAnsi="Arial" w:cs="Arial"/>
+                <w:kern w:val="0"/>
+                <w:sz w:val="18"/>
+                <w:szCs w:val="18"/>
+                <w:lang w:eastAsia="es-CO"/>
+                <w14:ligatures w14:val="none"/>
+              </w:rPr>
+            </w:pPr>
+            <w:r>
+              <w:rPr>
+                <w:rFonts w:ascii="Arial" w:eastAsia="Times New Roman" w:hAnsi="Arial" w:cs="Arial"/>
+                <w:kern w:val="0"/>
+                <w:sz w:val="18"/>
+                <w:szCs w:val="18"/>
+                <w:lang w:eastAsia="es-CO"/>
+                <w14:ligatures w14:val="none"/>
+              </w:rPr>
+              <w:t>Medio</w:t>
+            </w:r>
+          </w:p>
+        </w:tc>
+        <w:tc>
+          <w:tcPr>
+            <w:tcW w:w="1721" w:type="dxa"/>
+            <w:tcBorders>
+              <w:top w:val="single" w:sz="4" w:space="0" w:color="auto"/>
+              <w:left w:val="single" w:sz="4" w:space="0" w:color="auto"/>
+              <w:bottom w:val="single" w:sz="4" w:space="0" w:color="auto"/>
+              <w:right w:val="single" w:sz="4" w:space="0" w:color="auto"/>
+            </w:tcBorders>
+            <w:tcMar>
+              <w:top w:w="80" w:type="dxa"/>
+              <w:left w:w="100" w:type="dxa"/>
+              <w:bottom w:w="80" w:type="dxa"/>
+              <w:right w:w="100" w:type="dxa"/>
+            </w:tcMar>
+            <w:vAlign w:val="center"/>
+          </w:tcPr>
+          <w:p>
+            <w:pPr>
+              <w:spacing w:after="0" w:line="240" w:lineRule="auto"/>
+              <w:jc w:val="both"/>
+              <w:rPr>
+                <w:rFonts w:ascii="Arial" w:eastAsia="Times New Roman" w:hAnsi="Arial" w:cs="Arial"/>
+                <w:kern w:val="0"/>
+                <w:sz w:val="18"/>
+                <w:szCs w:val="18"/>
+                <w:lang w:eastAsia="es-CO"/>
+                <w14:ligatures w14:val="none"/>
+              </w:rPr>
+            </w:pPr>
+            <w:r>
+              <w:rPr>
+                <w:rFonts w:ascii="Arial" w:eastAsia="Times New Roman" w:hAnsi="Arial" w:cs="Arial"/>
+                <w:kern w:val="0"/>
+                <w:sz w:val="18"/>
+                <w:szCs w:val="18"/>
+                <w:lang w:eastAsia="es-CO"/>
+                <w14:ligatures w14:val="none"/>
+              </w:rPr>
+              <w:t>Se generaron los seis diagramas. Revisé la separación de responsabilidades y comprendí cómo representar las relaciones internas sin conectar directamente las bases de datos de los diferentes microservicios.</w:t>
+            </w:r>
+          </w:p>
+          <w:p>
+            <w:pPr>
+              <w:spacing w:after="0" w:line="240" w:lineRule="auto"/>
+              <w:jc w:val="both"/>
+              <w:rPr>
+                <w:rFonts w:ascii="Arial" w:eastAsia="Calibri" w:hAnsi="Arial" w:cs="Arial"/>
+                <w:color w:val="000000"/>
+                <w:kern w:val="0"/>
+                <w:sz w:val="18"/>
+                <w:szCs w:val="18"/>
+                <w:lang w:eastAsia="es-CO"/>
+                <w14:ligatures w14:val="none"/>
+              </w:rPr>
+            </w:pPr>
+          </w:p>
+        </w:tc>
+      </w:tr>
+      <w:tr>
+        <w:tc>
+          <w:tcPr>
+            <w:tcW w:w="1129" w:type="dxa"/>
+            <w:tcBorders>
+              <w:top w:val="single" w:sz="4" w:space="0" w:color="auto"/>
+              <w:left w:val="single" w:sz="4" w:space="0" w:color="auto"/>
+              <w:bottom w:val="single" w:sz="4" w:space="0" w:color="auto"/>
+              <w:right w:val="single" w:sz="4" w:space="0" w:color="auto"/>
+            </w:tcBorders>
+            <w:tcMar>
+              <w:top w:w="80" w:type="dxa"/>
+              <w:left w:w="100" w:type="dxa"/>
+              <w:bottom w:w="80" w:type="dxa"/>
+              <w:right w:w="100" w:type="dxa"/>
+            </w:tcMar>
+            <w:vAlign w:val="center"/>
+          </w:tcPr>
+          <w:p>
+            <w:pPr>
+              <w:spacing w:after="0" w:line="240" w:lineRule="auto"/>
+              <w:jc w:val="both"/>
+              <w:rPr>
+                <w:rFonts w:ascii="Arial" w:eastAsia="Calibri" w:hAnsi="Arial" w:cs="Arial"/>
+                <w:color w:val="000000"/>
+                <w:kern w:val="0"/>
+                <w:sz w:val="18"/>
+                <w:szCs w:val="18"/>
+                <w:lang w:eastAsia="es-CO"/>
+                <w14:ligatures w14:val="none"/>
+              </w:rPr>
+            </w:pPr>
+            <w:r>
+              <w:rPr>
+                <w:rFonts w:ascii="Arial" w:eastAsia="Calibri" w:hAnsi="Arial" w:cs="Arial"/>
+                <w:color w:val="000000"/>
+                <w:kern w:val="0"/>
+                <w:sz w:val="18"/>
+                <w:szCs w:val="18"/>
+                <w:lang w:eastAsia="es-CO"/>
+                <w14:ligatures w14:val="none"/>
+              </w:rPr>
+              <w:t>11</w:t>
+            </w:r>
+            <w:r>
+              <w:rPr>
+                <w:rFonts w:ascii="Arial" w:eastAsia="Calibri" w:hAnsi="Arial" w:cs="Arial"/>
+                <w:color w:val="000000"/>
+                <w:kern w:val="0"/>
+                <w:sz w:val="18"/>
+                <w:szCs w:val="18"/>
+                <w:lang w:eastAsia="es-CO"/>
+                <w14:ligatures w14:val="none"/>
+              </w:rPr>
+              <w:t>/10/2026</w:t>
+            </w:r>
+          </w:p>
+        </w:tc>
+        <w:tc>
+          <w:tcPr>
+            <w:tcW w:w="1134" w:type="dxa"/>
+            <w:tcBorders>
+              <w:top w:val="single" w:sz="4" w:space="0" w:color="auto"/>
+              <w:left w:val="single" w:sz="4" w:space="0" w:color="auto"/>
+              <w:bottom w:val="single" w:sz="4" w:space="0" w:color="auto"/>
+              <w:right w:val="single" w:sz="4" w:space="0" w:color="auto"/>
+            </w:tcBorders>
+            <w:tcMar>
+              <w:top w:w="80" w:type="dxa"/>
+              <w:left w:w="100" w:type="dxa"/>
+              <w:bottom w:w="80" w:type="dxa"/>
+              <w:right w:w="100" w:type="dxa"/>
+            </w:tcMar>
+            <w:vAlign w:val="center"/>
+          </w:tcPr>
+          <w:p>
+            <w:pPr>
+              <w:spacing w:after="0" w:line="240" w:lineRule="auto"/>
+              <w:jc w:val="both"/>
+              <w:rPr>
+                <w:rFonts w:ascii="Arial" w:eastAsia="Calibri" w:hAnsi="Arial" w:cs="Arial"/>
+                <w:color w:val="000000"/>
+                <w:kern w:val="0"/>
+                <w:sz w:val="18"/>
+                <w:szCs w:val="18"/>
+                <w:lang w:eastAsia="es-CO"/>
+                <w14:ligatures w14:val="none"/>
+              </w:rPr>
+            </w:pPr>
+            <w:r>
+              <w:rPr>
+                <w:rFonts w:ascii="Arial" w:eastAsia="Calibri" w:hAnsi="Arial" w:cs="Arial"/>
+                <w:color w:val="000000"/>
+                <w:kern w:val="0"/>
+                <w:sz w:val="18"/>
+                <w:szCs w:val="18"/>
+                <w:lang w:eastAsia="es-CO"/>
+                <w14:ligatures w14:val="none"/>
+              </w:rPr>
+              <w:t>Juan Sebastián Rivera Valencia</w:t>
+            </w:r>
+          </w:p>
+        </w:tc>
+        <w:tc>
+          <w:tcPr>
+            <w:tcW w:w="1137" w:type="dxa"/>
+            <w:tcBorders>
+              <w:top w:val="single" w:sz="4" w:space="0" w:color="auto"/>
+              <w:left w:val="single" w:sz="4" w:space="0" w:color="auto"/>
+              <w:bottom w:val="single" w:sz="4" w:space="0" w:color="auto"/>
+              <w:right w:val="single" w:sz="4" w:space="0" w:color="auto"/>
+            </w:tcBorders>
+            <w:tcMar>
+              <w:top w:w="80" w:type="dxa"/>
+              <w:left w:w="100" w:type="dxa"/>
+              <w:bottom w:w="80" w:type="dxa"/>
+              <w:right w:w="100" w:type="dxa"/>
+            </w:tcMar>
+            <w:vAlign w:val="center"/>
+          </w:tcPr>
+          <w:p>
+            <w:pPr>
+              <w:spacing w:after="0" w:line="240" w:lineRule="auto"/>
+              <w:jc w:val="both"/>
+              <w:rPr>
+                <w:rFonts w:ascii="Arial" w:eastAsia="Calibri" w:hAnsi="Arial" w:cs="Arial"/>
+                <w:color w:val="000000"/>
+                <w:kern w:val="0"/>
+                <w:sz w:val="18"/>
+                <w:szCs w:val="18"/>
+                <w:lang w:eastAsia="es-CO"/>
+                <w14:ligatures w14:val="none"/>
+              </w:rPr>
+            </w:pPr>
+            <w:proofErr w:type="spellStart"/>
+            <w:r>
+              <w:rPr>
+                <w:rFonts w:ascii="Arial" w:eastAsia="Calibri" w:hAnsi="Arial" w:cs="Arial"/>
+                <w:color w:val="000000"/>
+                <w:kern w:val="0"/>
+                <w:sz w:val="18"/>
+                <w:szCs w:val="18"/>
+                <w:lang w:eastAsia="es-CO"/>
+                <w14:ligatures w14:val="none"/>
+              </w:rPr>
+              <w:t>ChatGPT</w:t>
+            </w:r>
+            <w:proofErr w:type="spellEnd"/>
+          </w:p>
+        </w:tc>
+        <w:tc>
+          <w:tcPr>
+            <w:tcW w:w="1273" w:type="dxa"/>
+            <w:tcBorders>
+              <w:top w:val="single" w:sz="4" w:space="0" w:color="auto"/>
+              <w:left w:val="single" w:sz="4" w:space="0" w:color="auto"/>
+              <w:bottom w:val="single" w:sz="4" w:space="0" w:color="auto"/>
+              <w:right w:val="single" w:sz="4" w:space="0" w:color="auto"/>
+            </w:tcBorders>
+            <w:tcMar>
+              <w:top w:w="80" w:type="dxa"/>
+              <w:left w:w="100" w:type="dxa"/>
+              <w:bottom w:w="80" w:type="dxa"/>
+              <w:right w:w="100" w:type="dxa"/>
+            </w:tcMar>
+            <w:vAlign w:val="center"/>
+          </w:tcPr>
+          <w:p>
+            <w:pPr>
+              <w:spacing w:after="0" w:line="240" w:lineRule="auto"/>
+              <w:jc w:val="both"/>
+              <w:rPr>
+                <w:rFonts w:ascii="Arial" w:eastAsia="Times New Roman" w:hAnsi="Arial" w:cs="Arial"/>
+                <w:kern w:val="0"/>
+                <w:sz w:val="18"/>
+                <w:szCs w:val="18"/>
+                <w:lang w:eastAsia="es-CO"/>
+                <w14:ligatures w14:val="none"/>
+              </w:rPr>
+            </w:pPr>
+            <w:r>
+              <w:rPr>
+                <w:rFonts w:ascii="Arial" w:eastAsia="Times New Roman" w:hAnsi="Arial" w:cs="Arial"/>
+                <w:kern w:val="0"/>
+                <w:sz w:val="18"/>
+                <w:szCs w:val="18"/>
+                <w:lang w:eastAsia="es-CO"/>
+                <w14:ligatures w14:val="none"/>
+              </w:rPr>
+              <w:t>Evaluación de los modelos entidad-relación.</w:t>
+            </w:r>
+          </w:p>
+          <w:p>
+            <w:pPr>
+              <w:spacing w:after="0" w:line="240" w:lineRule="auto"/>
+              <w:jc w:val="both"/>
+              <w:rPr>
+                <w:rFonts w:ascii="Arial" w:eastAsia="Times New Roman" w:hAnsi="Arial" w:cs="Arial"/>
+                <w:kern w:val="0"/>
+                <w:sz w:val="18"/>
+                <w:szCs w:val="18"/>
+                <w:lang w:eastAsia="es-CO"/>
+                <w14:ligatures w14:val="none"/>
+              </w:rPr>
+            </w:pPr>
+          </w:p>
+        </w:tc>
+        <w:tc>
+          <w:tcPr>
+            <w:tcW w:w="2410" w:type="dxa"/>
+            <w:tcBorders>
+              <w:top w:val="single" w:sz="4" w:space="0" w:color="auto"/>
+              <w:left w:val="single" w:sz="4" w:space="0" w:color="auto"/>
+              <w:bottom w:val="single" w:sz="4" w:space="0" w:color="auto"/>
+              <w:right w:val="single" w:sz="4" w:space="0" w:color="auto"/>
+            </w:tcBorders>
+            <w:tcMar>
+              <w:top w:w="80" w:type="dxa"/>
+              <w:left w:w="100" w:type="dxa"/>
+              <w:bottom w:w="80" w:type="dxa"/>
+              <w:right w:w="100" w:type="dxa"/>
+            </w:tcMar>
+            <w:vAlign w:val="center"/>
+          </w:tcPr>
+          <w:p>
+            <w:pPr>
+              <w:spacing w:after="0" w:line="240" w:lineRule="auto"/>
+              <w:jc w:val="both"/>
+              <w:rPr>
+                <w:rFonts w:ascii="Arial" w:eastAsia="Calibri" w:hAnsi="Arial" w:cs="Arial"/>
+                <w:color w:val="000000"/>
+                <w:kern w:val="0"/>
+                <w:sz w:val="18"/>
+                <w:szCs w:val="18"/>
+                <w:lang w:eastAsia="es-CO"/>
+                <w14:ligatures w14:val="none"/>
+              </w:rPr>
+            </w:pPr>
+            <w:r>
+              <w:rPr>
+                <w:rFonts w:ascii="Arial" w:eastAsia="Calibri" w:hAnsi="Arial" w:cs="Arial"/>
+                <w:color w:val="000000"/>
+                <w:kern w:val="0"/>
+                <w:sz w:val="18"/>
+                <w:szCs w:val="18"/>
+                <w:lang w:eastAsia="es-CO"/>
+                <w14:ligatures w14:val="none"/>
+              </w:rPr>
+              <w:t>Revisa los seis diagramas generados y compáralos con los requerimientos de la primera entrega. Identifica posibles problemas en las entidades, relaciones, claves foráneas, cardinalidades y separación de bases de datos.</w:t>
+            </w:r>
+          </w:p>
+          <w:p>
+            <w:pPr>
+              <w:spacing w:after="0" w:line="240" w:lineRule="auto"/>
+              <w:jc w:val="both"/>
+              <w:rPr>
+                <w:rFonts w:ascii="Arial" w:eastAsia="Calibri" w:hAnsi="Arial" w:cs="Arial"/>
+                <w:color w:val="000000"/>
+                <w:kern w:val="0"/>
+                <w:sz w:val="18"/>
+                <w:szCs w:val="18"/>
+                <w:lang w:eastAsia="es-CO"/>
+                <w14:ligatures w14:val="none"/>
+              </w:rPr>
+            </w:pPr>
+          </w:p>
+        </w:tc>
+        <w:tc>
+          <w:tcPr>
+            <w:tcW w:w="1276" w:type="dxa"/>
+            <w:tcBorders>
+              <w:top w:val="single" w:sz="4" w:space="0" w:color="auto"/>
+              <w:left w:val="single" w:sz="4" w:space="0" w:color="auto"/>
+              <w:bottom w:val="single" w:sz="4" w:space="0" w:color="auto"/>
+              <w:right w:val="single" w:sz="4" w:space="0" w:color="auto"/>
+            </w:tcBorders>
+            <w:tcMar>
+              <w:top w:w="80" w:type="dxa"/>
+              <w:left w:w="100" w:type="dxa"/>
+              <w:bottom w:w="80" w:type="dxa"/>
+              <w:right w:w="100" w:type="dxa"/>
+            </w:tcMar>
+            <w:vAlign w:val="center"/>
+          </w:tcPr>
+          <w:p>
+            <w:pPr>
+              <w:spacing w:after="0" w:line="240" w:lineRule="auto"/>
+              <w:jc w:val="center"/>
+              <w:rPr>
+                <w:rFonts w:ascii="Arial" w:eastAsia="Times New Roman" w:hAnsi="Arial" w:cs="Arial"/>
+                <w:kern w:val="0"/>
+                <w:sz w:val="18"/>
+                <w:szCs w:val="18"/>
+                <w:lang w:eastAsia="es-CO"/>
+                <w14:ligatures w14:val="none"/>
+              </w:rPr>
+            </w:pPr>
+            <w:r>
+              <w:rPr>
+                <w:rFonts w:ascii="Arial" w:eastAsia="Times New Roman" w:hAnsi="Arial" w:cs="Arial"/>
+                <w:kern w:val="0"/>
+                <w:sz w:val="18"/>
+                <w:szCs w:val="18"/>
+                <w:lang w:eastAsia="es-CO"/>
+                <w14:ligatures w14:val="none"/>
+              </w:rPr>
+              <w:t>Alto</w:t>
+            </w:r>
+          </w:p>
+        </w:tc>
+        <w:tc>
+          <w:tcPr>
+            <w:tcW w:w="1721" w:type="dxa"/>
+            <w:tcBorders>
+              <w:top w:val="single" w:sz="4" w:space="0" w:color="auto"/>
+              <w:left w:val="single" w:sz="4" w:space="0" w:color="auto"/>
+              <w:bottom w:val="single" w:sz="4" w:space="0" w:color="auto"/>
+              <w:right w:val="single" w:sz="4" w:space="0" w:color="auto"/>
+            </w:tcBorders>
+            <w:tcMar>
+              <w:top w:w="80" w:type="dxa"/>
+              <w:left w:w="100" w:type="dxa"/>
+              <w:bottom w:w="80" w:type="dxa"/>
+              <w:right w:w="100" w:type="dxa"/>
+            </w:tcMar>
+            <w:vAlign w:val="center"/>
+          </w:tcPr>
+          <w:p>
+            <w:pPr>
+              <w:spacing w:after="0" w:line="240" w:lineRule="auto"/>
+              <w:jc w:val="both"/>
+              <w:rPr>
+                <w:rFonts w:ascii="Arial" w:eastAsia="Calibri" w:hAnsi="Arial" w:cs="Arial"/>
+                <w:color w:val="000000"/>
+                <w:kern w:val="0"/>
+                <w:sz w:val="18"/>
+                <w:szCs w:val="18"/>
+                <w:lang w:eastAsia="es-CO"/>
+                <w14:ligatures w14:val="none"/>
+              </w:rPr>
+            </w:pPr>
+            <w:proofErr w:type="spellStart"/>
+            <w:r>
+              <w:rPr>
+                <w:rFonts w:ascii="Arial" w:eastAsia="Calibri" w:hAnsi="Arial" w:cs="Arial"/>
+                <w:color w:val="000000"/>
+                <w:kern w:val="0"/>
+                <w:sz w:val="18"/>
+                <w:szCs w:val="18"/>
+                <w:lang w:eastAsia="es-CO"/>
+                <w14:ligatures w14:val="none"/>
+              </w:rPr>
+              <w:t>dentifiqué</w:t>
+            </w:r>
+            <w:proofErr w:type="spellEnd"/>
+            <w:r>
+              <w:rPr>
+                <w:rFonts w:ascii="Arial" w:eastAsia="Calibri" w:hAnsi="Arial" w:cs="Arial"/>
+                <w:color w:val="000000"/>
+                <w:kern w:val="0"/>
+                <w:sz w:val="18"/>
+                <w:szCs w:val="18"/>
+                <w:lang w:eastAsia="es-CO"/>
+                <w14:ligatures w14:val="none"/>
+              </w:rPr>
+              <w:t xml:space="preserve"> aspectos</w:t>
+            </w:r>
+            <w:r>
+              <w:rPr>
+                <w:rFonts w:ascii="Arial" w:eastAsia="Calibri" w:hAnsi="Arial" w:cs="Arial"/>
+                <w:color w:val="000000"/>
+                <w:kern w:val="0"/>
+                <w:sz w:val="18"/>
+                <w:szCs w:val="18"/>
+                <w:lang w:eastAsia="es-CO"/>
+                <w14:ligatures w14:val="none"/>
+              </w:rPr>
+              <w:t xml:space="preserve"> </w:t>
+            </w:r>
+            <w:r>
+              <w:rPr>
+                <w:rFonts w:ascii="Arial" w:eastAsia="Calibri" w:hAnsi="Arial" w:cs="Arial"/>
+                <w:color w:val="000000"/>
+                <w:kern w:val="0"/>
+                <w:sz w:val="18"/>
+                <w:szCs w:val="18"/>
+                <w:lang w:eastAsia="es-CO"/>
+                <w14:ligatures w14:val="none"/>
+              </w:rPr>
+              <w:t>que requerían revisión, especialmente las relaciones de inventario, las recepciones de mercancía, los estados de ventas y las referencias a productos de otros microservicios.</w:t>
+            </w:r>
+          </w:p>
+          <w:p>
+            <w:pPr>
+              <w:spacing w:after="0" w:line="240" w:lineRule="auto"/>
+              <w:jc w:val="both"/>
+              <w:rPr>
+                <w:rFonts w:ascii="Arial" w:eastAsia="Calibri" w:hAnsi="Arial" w:cs="Arial"/>
+                <w:color w:val="000000"/>
+                <w:kern w:val="0"/>
+                <w:sz w:val="18"/>
+                <w:szCs w:val="18"/>
+                <w:lang w:eastAsia="es-CO"/>
+                <w14:ligatures w14:val="none"/>
+              </w:rPr>
+            </w:pPr>
+          </w:p>
+        </w:tc>
+      </w:tr>
+      <w:tr>
+        <w:tc>
+          <w:tcPr>
+            <w:tcW w:w="1129" w:type="dxa"/>
+            <w:tcBorders>
+              <w:top w:val="single" w:sz="4" w:space="0" w:color="auto"/>
+              <w:left w:val="single" w:sz="4" w:space="0" w:color="auto"/>
+              <w:bottom w:val="single" w:sz="4" w:space="0" w:color="auto"/>
+              <w:right w:val="single" w:sz="4" w:space="0" w:color="auto"/>
+            </w:tcBorders>
+            <w:tcMar>
+              <w:top w:w="80" w:type="dxa"/>
+              <w:left w:w="100" w:type="dxa"/>
+              <w:bottom w:w="80" w:type="dxa"/>
+              <w:right w:w="100" w:type="dxa"/>
+            </w:tcMar>
+            <w:vAlign w:val="center"/>
+          </w:tcPr>
+          <w:p>
+            <w:pPr>
+              <w:spacing w:after="0" w:line="240" w:lineRule="auto"/>
+              <w:jc w:val="both"/>
+              <w:rPr>
+                <w:rFonts w:ascii="Arial" w:eastAsia="Calibri" w:hAnsi="Arial" w:cs="Arial"/>
+                <w:color w:val="000000"/>
+                <w:kern w:val="0"/>
+                <w:sz w:val="18"/>
+                <w:szCs w:val="18"/>
+                <w:lang w:eastAsia="es-CO"/>
+                <w14:ligatures w14:val="none"/>
+              </w:rPr>
+            </w:pPr>
+            <w:r>
+              <w:rPr>
+                <w:rFonts w:ascii="Arial" w:eastAsia="Calibri" w:hAnsi="Arial" w:cs="Arial"/>
+                <w:color w:val="000000"/>
+                <w:kern w:val="0"/>
+                <w:sz w:val="18"/>
+                <w:szCs w:val="18"/>
+                <w:lang w:eastAsia="es-CO"/>
+                <w14:ligatures w14:val="none"/>
+              </w:rPr>
+              <w:t>11</w:t>
+            </w:r>
+            <w:r>
+              <w:rPr>
+                <w:rFonts w:ascii="Arial" w:eastAsia="Calibri" w:hAnsi="Arial" w:cs="Arial"/>
+                <w:color w:val="000000"/>
+                <w:kern w:val="0"/>
+                <w:sz w:val="18"/>
+                <w:szCs w:val="18"/>
+                <w:lang w:eastAsia="es-CO"/>
+                <w14:ligatures w14:val="none"/>
+              </w:rPr>
+              <w:t>/10/2026</w:t>
+            </w:r>
+          </w:p>
+        </w:tc>
+        <w:tc>
+          <w:tcPr>
+            <w:tcW w:w="1134" w:type="dxa"/>
+            <w:tcBorders>
+              <w:top w:val="single" w:sz="4" w:space="0" w:color="auto"/>
+              <w:left w:val="single" w:sz="4" w:space="0" w:color="auto"/>
+              <w:bottom w:val="single" w:sz="4" w:space="0" w:color="auto"/>
+              <w:right w:val="single" w:sz="4" w:space="0" w:color="auto"/>
+            </w:tcBorders>
+            <w:tcMar>
+              <w:top w:w="80" w:type="dxa"/>
+              <w:left w:w="100" w:type="dxa"/>
+              <w:bottom w:w="80" w:type="dxa"/>
+              <w:right w:w="100" w:type="dxa"/>
+            </w:tcMar>
+            <w:vAlign w:val="center"/>
+          </w:tcPr>
+          <w:p>
+            <w:pPr>
+              <w:spacing w:after="0" w:line="240" w:lineRule="auto"/>
+              <w:jc w:val="both"/>
+              <w:rPr>
+                <w:rFonts w:ascii="Arial" w:eastAsia="Calibri" w:hAnsi="Arial" w:cs="Arial"/>
+                <w:color w:val="000000"/>
+                <w:kern w:val="0"/>
+                <w:sz w:val="18"/>
+                <w:szCs w:val="18"/>
+                <w:lang w:eastAsia="es-CO"/>
+                <w14:ligatures w14:val="none"/>
+              </w:rPr>
+            </w:pPr>
+            <w:r>
+              <w:rPr>
+                <w:rFonts w:ascii="Arial" w:eastAsia="Calibri" w:hAnsi="Arial" w:cs="Arial"/>
+                <w:color w:val="000000"/>
+                <w:kern w:val="0"/>
+                <w:sz w:val="18"/>
+                <w:szCs w:val="18"/>
+                <w:lang w:eastAsia="es-CO"/>
+                <w14:ligatures w14:val="none"/>
+              </w:rPr>
+              <w:t>Juan Sebastián Rivera Valencia</w:t>
+            </w:r>
+          </w:p>
+        </w:tc>
+        <w:tc>
+          <w:tcPr>
+            <w:tcW w:w="1137" w:type="dxa"/>
+            <w:tcBorders>
+              <w:top w:val="single" w:sz="4" w:space="0" w:color="auto"/>
+              <w:left w:val="single" w:sz="4" w:space="0" w:color="auto"/>
+              <w:bottom w:val="single" w:sz="4" w:space="0" w:color="auto"/>
+              <w:right w:val="single" w:sz="4" w:space="0" w:color="auto"/>
+            </w:tcBorders>
+            <w:tcMar>
+              <w:top w:w="80" w:type="dxa"/>
+              <w:left w:w="100" w:type="dxa"/>
+              <w:bottom w:w="80" w:type="dxa"/>
+              <w:right w:w="100" w:type="dxa"/>
+            </w:tcMar>
+            <w:vAlign w:val="center"/>
+          </w:tcPr>
+          <w:p>
+            <w:pPr>
+              <w:spacing w:after="0" w:line="240" w:lineRule="auto"/>
+              <w:jc w:val="both"/>
+              <w:rPr>
+                <w:rFonts w:ascii="Arial" w:eastAsia="Calibri" w:hAnsi="Arial" w:cs="Arial"/>
+                <w:color w:val="000000"/>
+                <w:kern w:val="0"/>
+                <w:sz w:val="18"/>
+                <w:szCs w:val="18"/>
+                <w:lang w:eastAsia="es-CO"/>
+                <w14:ligatures w14:val="none"/>
+              </w:rPr>
+            </w:pPr>
+            <w:proofErr w:type="spellStart"/>
+            <w:r>
+              <w:rPr>
+                <w:rFonts w:ascii="Arial" w:eastAsia="Calibri" w:hAnsi="Arial" w:cs="Arial"/>
+                <w:color w:val="000000"/>
+                <w:kern w:val="0"/>
+                <w:sz w:val="18"/>
+                <w:szCs w:val="18"/>
+                <w:lang w:eastAsia="es-CO"/>
+                <w14:ligatures w14:val="none"/>
+              </w:rPr>
+              <w:t>ChatGPT</w:t>
+            </w:r>
+            <w:proofErr w:type="spellEnd"/>
+          </w:p>
+        </w:tc>
+        <w:tc>
+          <w:tcPr>
+            <w:tcW w:w="1273" w:type="dxa"/>
+            <w:tcBorders>
+              <w:top w:val="single" w:sz="4" w:space="0" w:color="auto"/>
+              <w:left w:val="single" w:sz="4" w:space="0" w:color="auto"/>
+              <w:bottom w:val="single" w:sz="4" w:space="0" w:color="auto"/>
+              <w:right w:val="single" w:sz="4" w:space="0" w:color="auto"/>
+            </w:tcBorders>
+            <w:tcMar>
+              <w:top w:w="80" w:type="dxa"/>
+              <w:left w:w="100" w:type="dxa"/>
+              <w:bottom w:w="80" w:type="dxa"/>
+              <w:right w:w="100" w:type="dxa"/>
+            </w:tcMar>
+            <w:vAlign w:val="center"/>
+          </w:tcPr>
+          <w:p>
+            <w:pPr>
+              <w:spacing w:after="0" w:line="240" w:lineRule="auto"/>
+              <w:jc w:val="both"/>
+              <w:rPr>
+                <w:rFonts w:ascii="Arial" w:eastAsia="Times New Roman" w:hAnsi="Arial" w:cs="Arial"/>
+                <w:kern w:val="0"/>
+                <w:sz w:val="18"/>
+                <w:szCs w:val="18"/>
+                <w:lang w:eastAsia="es-CO"/>
+                <w14:ligatures w14:val="none"/>
+              </w:rPr>
+            </w:pPr>
+            <w:r>
+              <w:rPr>
+                <w:rFonts w:ascii="Arial" w:eastAsia="Times New Roman" w:hAnsi="Arial" w:cs="Arial"/>
+                <w:kern w:val="0"/>
+                <w:sz w:val="18"/>
+                <w:szCs w:val="18"/>
+                <w:lang w:eastAsia="es-CO"/>
+                <w14:ligatures w14:val="none"/>
+              </w:rPr>
+              <w:t>Corrección y validación final de diagramas.</w:t>
+            </w:r>
+          </w:p>
+          <w:p>
+            <w:pPr>
+              <w:spacing w:after="0" w:line="240" w:lineRule="auto"/>
+              <w:jc w:val="both"/>
+              <w:rPr>
+                <w:rFonts w:ascii="Arial" w:eastAsia="Times New Roman" w:hAnsi="Arial" w:cs="Arial"/>
+                <w:kern w:val="0"/>
+                <w:sz w:val="18"/>
+                <w:szCs w:val="18"/>
+                <w:lang w:eastAsia="es-CO"/>
+                <w14:ligatures w14:val="none"/>
+              </w:rPr>
+            </w:pPr>
+          </w:p>
+        </w:tc>
+        <w:tc>
+          <w:tcPr>
+            <w:tcW w:w="2410" w:type="dxa"/>
+            <w:tcBorders>
+              <w:top w:val="single" w:sz="4" w:space="0" w:color="auto"/>
+              <w:left w:val="single" w:sz="4" w:space="0" w:color="auto"/>
+              <w:bottom w:val="single" w:sz="4" w:space="0" w:color="auto"/>
+              <w:right w:val="single" w:sz="4" w:space="0" w:color="auto"/>
+            </w:tcBorders>
+            <w:tcMar>
+              <w:top w:w="80" w:type="dxa"/>
+              <w:left w:w="100" w:type="dxa"/>
+              <w:bottom w:w="80" w:type="dxa"/>
+              <w:right w:w="100" w:type="dxa"/>
+            </w:tcMar>
+            <w:vAlign w:val="center"/>
+          </w:tcPr>
+          <w:p>
+            <w:pPr>
+              <w:spacing w:after="0" w:line="240" w:lineRule="auto"/>
+              <w:jc w:val="both"/>
+              <w:rPr>
+                <w:rFonts w:ascii="Arial" w:eastAsia="Calibri" w:hAnsi="Arial" w:cs="Arial"/>
+                <w:color w:val="000000"/>
+                <w:kern w:val="0"/>
+                <w:sz w:val="18"/>
+                <w:szCs w:val="18"/>
+                <w:lang w:eastAsia="es-CO"/>
+                <w14:ligatures w14:val="none"/>
+              </w:rPr>
+            </w:pPr>
+            <w:r>
+              <w:rPr>
+                <w:rFonts w:ascii="Arial" w:eastAsia="Calibri" w:hAnsi="Arial" w:cs="Arial"/>
+                <w:color w:val="000000"/>
+                <w:kern w:val="0"/>
+                <w:sz w:val="18"/>
+                <w:szCs w:val="18"/>
+                <w:lang w:eastAsia="es-CO"/>
+                <w14:ligatures w14:val="none"/>
+              </w:rPr>
+              <w:t>Revisa y corrige la cardinalidad entre productos y detalles de importación, las bodegas de origen y destino de los movimientos, los estados de recepción de mercancía y la confirmación de ventas. Conserva las seis bases de datos independientes y entrega los diagramas corregidos.</w:t>
+            </w:r>
+          </w:p>
+          <w:p>
+            <w:pPr>
+              <w:spacing w:after="0" w:line="240" w:lineRule="auto"/>
+              <w:jc w:val="both"/>
+              <w:rPr>
+                <w:rFonts w:ascii="Arial" w:eastAsia="Calibri" w:hAnsi="Arial" w:cs="Arial"/>
+                <w:color w:val="000000"/>
+                <w:kern w:val="0"/>
+                <w:sz w:val="18"/>
+                <w:szCs w:val="18"/>
+                <w:lang w:eastAsia="es-CO"/>
+                <w14:ligatures w14:val="none"/>
+              </w:rPr>
+            </w:pPr>
+          </w:p>
+        </w:tc>
+        <w:tc>
+          <w:tcPr>
+            <w:tcW w:w="1276" w:type="dxa"/>
+            <w:tcBorders>
+              <w:top w:val="single" w:sz="4" w:space="0" w:color="auto"/>
+              <w:left w:val="single" w:sz="4" w:space="0" w:color="auto"/>
+              <w:bottom w:val="single" w:sz="4" w:space="0" w:color="auto"/>
+              <w:right w:val="single" w:sz="4" w:space="0" w:color="auto"/>
+            </w:tcBorders>
+            <w:tcMar>
+              <w:top w:w="80" w:type="dxa"/>
+              <w:left w:w="100" w:type="dxa"/>
+              <w:bottom w:w="80" w:type="dxa"/>
+              <w:right w:w="100" w:type="dxa"/>
+            </w:tcMar>
+            <w:vAlign w:val="center"/>
+          </w:tcPr>
+          <w:p>
+            <w:pPr>
+              <w:spacing w:after="0" w:line="240" w:lineRule="auto"/>
+              <w:jc w:val="center"/>
+              <w:rPr>
+                <w:rFonts w:ascii="Arial" w:eastAsia="Times New Roman" w:hAnsi="Arial" w:cs="Arial"/>
+                <w:kern w:val="0"/>
+                <w:sz w:val="18"/>
+                <w:szCs w:val="18"/>
+                <w:lang w:eastAsia="es-CO"/>
+                <w14:ligatures w14:val="none"/>
+              </w:rPr>
+            </w:pPr>
+            <w:r>
+              <w:rPr>
+                <w:rFonts w:ascii="Arial" w:eastAsia="Times New Roman" w:hAnsi="Arial" w:cs="Arial"/>
+                <w:kern w:val="0"/>
+                <w:sz w:val="18"/>
+                <w:szCs w:val="18"/>
+                <w:lang w:eastAsia="es-CO"/>
+                <w14:ligatures w14:val="none"/>
+              </w:rPr>
+              <w:t>Medio</w:t>
+            </w:r>
+          </w:p>
+        </w:tc>
+        <w:tc>
+          <w:tcPr>
+            <w:tcW w:w="1721" w:type="dxa"/>
+            <w:tcBorders>
+              <w:top w:val="single" w:sz="4" w:space="0" w:color="auto"/>
+              <w:left w:val="single" w:sz="4" w:space="0" w:color="auto"/>
+              <w:bottom w:val="single" w:sz="4" w:space="0" w:color="auto"/>
+              <w:right w:val="single" w:sz="4" w:space="0" w:color="auto"/>
+            </w:tcBorders>
+            <w:tcMar>
+              <w:top w:w="80" w:type="dxa"/>
+              <w:left w:w="100" w:type="dxa"/>
+              <w:bottom w:w="80" w:type="dxa"/>
+              <w:right w:w="100" w:type="dxa"/>
+            </w:tcMar>
+            <w:vAlign w:val="center"/>
+          </w:tcPr>
+          <w:p>
+            <w:pPr>
+              <w:spacing w:after="0" w:line="240" w:lineRule="auto"/>
+              <w:jc w:val="both"/>
+              <w:rPr>
+                <w:rFonts w:ascii="Arial" w:eastAsia="Calibri" w:hAnsi="Arial" w:cs="Arial"/>
+                <w:color w:val="000000"/>
+                <w:kern w:val="0"/>
+                <w:sz w:val="18"/>
+                <w:szCs w:val="18"/>
+                <w:lang w:eastAsia="es-CO"/>
+                <w14:ligatures w14:val="none"/>
+              </w:rPr>
+            </w:pPr>
+            <w:r>
+              <w:rPr>
+                <w:rFonts w:ascii="Arial" w:eastAsia="Calibri" w:hAnsi="Arial" w:cs="Arial"/>
+                <w:color w:val="000000"/>
+                <w:kern w:val="0"/>
+                <w:sz w:val="18"/>
+                <w:szCs w:val="18"/>
+                <w:lang w:eastAsia="es-CO"/>
+                <w14:ligatures w14:val="none"/>
+              </w:rPr>
+              <w:t>Se corrigieron y documentaron las relaciones y reglas principales. Comprendí que una venta debe confirmarse después de actualizar correctamente el inventario</w:t>
+            </w:r>
+          </w:p>
+          <w:p>
+            <w:pPr>
+              <w:spacing w:after="0" w:line="240" w:lineRule="auto"/>
+              <w:jc w:val="both"/>
+              <w:rPr>
+                <w:rFonts w:ascii="Arial" w:eastAsia="Calibri" w:hAnsi="Arial" w:cs="Arial"/>
+                <w:color w:val="000000"/>
+                <w:kern w:val="0"/>
+                <w:sz w:val="18"/>
+                <w:szCs w:val="18"/>
+                <w:lang w:eastAsia="es-CO"/>
+                <w14:ligatures w14:val="none"/>
+              </w:rPr>
+            </w:pPr>
+          </w:p>
+        </w:tc>
+      </w:tr>
+    </w:tbl>
     <w:p/>
     <w:sectPr>
       <w:pgSz w:w="12240" w:h="15840"/>
@@ -6371,7 +8365,7 @@
   <w:style w:type="paragraph" w:default="1" w:styleId="Normal">
     <w:name w:val="Normal"/>
     <w:qFormat/>
-    <w:rsid w:val="00F55622"/>
+    <w:rsid w:val="00BD3A11"/>
   </w:style>
   <w:style w:type="paragraph" w:styleId="Ttulo1">
     <w:name w:val="heading 1"/>
@@ -6573,7 +8567,6 @@
   <w:style w:type="character" w:default="1" w:styleId="Fuentedeprrafopredeter">
     <w:name w:val="Default Paragraph Font"/>
     <w:uiPriority w:val="1"/>
-    <w:semiHidden/>
     <w:unhideWhenUsed/>
   </w:style>
   <w:style w:type="table" w:default="1" w:styleId="Tablanormal">

</xml_diff>